<commit_message>
Reframe Katamkpe buyer proposal as warm personal referral via AVM Morgan, not cold pitch
</commit_message>
<xml_diff>
--- a/documents_aug2026/katamkpe_project/KATAMKPE_TERRACE_UNIT_BUYER_PROPOSAL.docx
+++ b/documents_aug2026/katamkpe_project/KATAMKPE_TERRACE_UNIT_BUYER_PROPOSAL.docx
@@ -29,7 +29,7 @@
           <w:color w:val="0F172A"/>
           <w:sz w:val="44"/>
         </w:rPr>
-        <w:t>EXCLUSIVE INVESTMENT OFFER</w:t>
+        <w:t>A PERSONAL INTRODUCTION &amp; INVESTMENT OFFER</w:t>
       </w:r>
     </w:p>
     <w:p>
@@ -59,7 +59,22 @@
           <w:color w:val="222222"/>
           <w:sz w:val="22"/>
         </w:rPr>
-        <w:t>Prepared for: Prospective Buyer</w:t>
+        <w:t>Prepared for: A close personal contact of AVM Monday Riku Morgan (Rtd)</w:t>
+      </w:r>
+    </w:p>
+    <w:p>
+      <w:pPr>
+        <w:spacing w:after="40" w:line="276" w:lineRule="auto"/>
+      </w:pPr>
+      <w:r>
+        <w:rPr>
+          <w:rFonts w:ascii="Calibri" w:hAnsi="Calibri"/>
+          <w:b/>
+          <w:i w:val="0"/>
+          <w:color w:val="222222"/>
+          <w:sz w:val="22"/>
+        </w:rPr>
+        <w:t>Introduced by: AVM Monday Riku Morgan (Rtd) — Chairman</w:t>
       </w:r>
     </w:p>
     <w:p>
@@ -116,7 +131,22 @@
           <w:color w:val="0F172A"/>
           <w:sz w:val="28"/>
         </w:rPr>
-        <w:t>A Rare Entry Point Into One of Abuja's Fastest-Appreciating Corridors</w:t>
+        <w:t>A Personal Opportunity, Not a Public Listing</w:t>
+      </w:r>
+    </w:p>
+    <w:p>
+      <w:pPr>
+        <w:spacing w:after="160" w:line="276" w:lineRule="auto"/>
+      </w:pPr>
+      <w:r>
+        <w:rPr>
+          <w:rFonts w:ascii="Calibri" w:hAnsi="Calibri"/>
+          <w:b w:val="0"/>
+          <w:i w:val="0"/>
+          <w:color w:val="222222"/>
+          <w:sz w:val="22"/>
+        </w:rPr>
+        <w:t>This offer is coming to you directly because AVM Monday Riku Morgan (Rtd) wanted someone he personally trusts to have first right of consideration before this unit is ever presented to the open market. It is not a generic sales pitch — it is a genuine, time-limited courtesy extended through that relationship, on terms that reflect it.</w:t>
       </w:r>
     </w:p>
     <w:p>
@@ -2053,7 +2083,7 @@
           <w:color w:val="222222"/>
           <w:sz w:val="22"/>
         </w:rPr>
-        <w:t>This proposal is offered in good faith as an exclusive, time-sensitive opportunity. We welcome a site visit at your convenience to inspect the unit, the estate, and the highway frontage firsthand before proceeding.</w:t>
+        <w:t>This proposal is offered in good faith, as a personal courtesy through AVM Monday Riku Morgan (Rtd), before this unit is offered any further. We welcome a site visit at your convenience — with AVM Morgan or independently — to inspect the unit, the estate, and the highway frontage firsthand before proceeding.</w:t>
       </w:r>
     </w:p>
     <w:p>
@@ -2099,6 +2129,21 @@
           <w:sz w:val="21"/>
         </w:rPr>
         <w:t>On behalf of the Katamkpe Estate Development</w:t>
+      </w:r>
+    </w:p>
+    <w:p>
+      <w:pPr>
+        <w:spacing w:after="40" w:line="276" w:lineRule="auto"/>
+      </w:pPr>
+      <w:r>
+        <w:rPr>
+          <w:rFonts w:ascii="Calibri" w:hAnsi="Calibri"/>
+          <w:b w:val="0"/>
+          <w:i/>
+          <w:color w:val="222222"/>
+          <w:sz w:val="21"/>
+        </w:rPr>
+        <w:t>With the personal introduction of AVM Monday Riku Morgan (Rtd), Chairman</w:t>
       </w:r>
     </w:p>
     <w:sectPr>

</xml_diff>

<commit_message>
Rework Katamkpe buyer proposal: correct site stage (pre-first-floor, no roofing, fence 70%, land split), reframe as developer build-and-resell offer
</commit_message>
<xml_diff>
--- a/documents_aug2026/katamkpe_project/KATAMKPE_TERRACE_UNIT_BUYER_PROPOSAL.docx
+++ b/documents_aug2026/katamkpe_project/KATAMKPE_TERRACE_UNIT_BUYER_PROPOSAL.docx
@@ -29,7 +29,7 @@
           <w:color w:val="0F172A"/>
           <w:sz w:val="44"/>
         </w:rPr>
-        <w:t>A PERSONAL INTRODUCTION &amp; INVESTMENT OFFER</w:t>
+        <w:t>DEVELOPER-TO-DEVELOPER OFFER</w:t>
       </w:r>
     </w:p>
     <w:p>
@@ -44,7 +44,7 @@
           <w:color w:val="0F172A"/>
           <w:sz w:val="26"/>
         </w:rPr>
-        <w:t>KATAMKPE LUXURY TERRACE ESTATE — TERRACE UNIT FOR SALE (CARCASS / UNFINISHED)</w:t>
+        <w:t>KATAMKPE LUXURY TERRACE ESTATE — TERRACE UNIT FOR SALE (PRE-FIRST-FLOOR STAGE)</w:t>
       </w:r>
     </w:p>
     <w:p>
@@ -59,7 +59,7 @@
           <w:color w:val="222222"/>
           <w:sz w:val="22"/>
         </w:rPr>
-        <w:t>Prepared for: A close personal contact of AVM Monday Riku Morgan (Rtd)</w:t>
+        <w:t>Prepared for: A close personal contact of AVM Monday Riku Morgan (Rtd) — Developer/Buyer</w:t>
       </w:r>
     </w:p>
     <w:p>
@@ -131,7 +131,7 @@
           <w:color w:val="0F172A"/>
           <w:sz w:val="28"/>
         </w:rPr>
-        <w:t>A Personal Opportunity, Not a Public Listing</w:t>
+        <w:t>A Straight Numbers Conversation, Between People Who Build</w:t>
       </w:r>
     </w:p>
     <w:p>
@@ -146,7 +146,7 @@
           <w:color w:val="222222"/>
           <w:sz w:val="22"/>
         </w:rPr>
-        <w:t>This offer is coming to you directly because AVM Monday Riku Morgan (Rtd) wanted someone he personally trusts to have first right of consideration before this unit is ever presented to the open market. It is not a generic sales pitch — it is a genuine, time-limited courtesy extended through that relationship, on terms that reflect it.</w:t>
+        <w:t>You have already been to site. You know exactly what stage this unit is at, you have seen the block work, the decking, the fence line — so this proposal will not waste your time dressing up what is plainly in front of you. What follows is the actual cost position, the real completion scope remaining, and the resale economics, presented the way one developer would want to see them from another.</w:t>
       </w:r>
     </w:p>
     <w:p>
@@ -161,7 +161,7 @@
           <w:color w:val="222222"/>
           <w:sz w:val="22"/>
         </w:rPr>
-        <w:t>Katamkpe is not a speculative land banking play — it is nine architecturally distinct luxury terrace units, arranged in a striking L-shaped configuration, sitting directly parallel to a newly completed 4-lane super highway that has transformed access into this corridor almost overnight. What was, until recently, a quiet stretch of premium Abuja real estate is now a highway-fronted address — and highway-fronted luxury addresses in the FCT do not stay affordable for long.</w:t>
+        <w:t>This comes to you through AVM Monday Riku Morgan (Rtd), who wanted a serious, capable buyer to have first look at this unit as a build-and-resell opportunity before it goes any further.</w:t>
       </w:r>
     </w:p>
     <w:p>
@@ -175,7 +175,7 @@
           <w:color w:val="222222"/>
           <w:sz w:val="22"/>
         </w:rPr>
-        <w:t xml:space="preserve">This offer concerns one single unit </w:t>
+        <w:t xml:space="preserve">The proposition is simple: acquire this unit at its current pre-first-floor stage, take it through completion yourself at your own cost and pace, and resell at </w:t>
       </w:r>
       <w:r>
         <w:rPr>
@@ -184,7 +184,7 @@
           <w:color w:val="222222"/>
           <w:sz w:val="22"/>
         </w:rPr>
-        <w:t>still at carcass stage — structurally complete, roofed, and standing, but intentionally left unfinished.</w:t>
+        <w:t>full finished market value.</w:t>
       </w:r>
       <w:r>
         <w:rPr>
@@ -193,22 +193,7 @@
           <w:color w:val="222222"/>
           <w:sz w:val="22"/>
         </w:rPr>
-        <w:t xml:space="preserve"> That is not a defect. It is the opportunity. You are not buying a finished house at a finished-house price. You are stepping in ahead of the finishing phase, at a materially lower entry cost, with full control over every tile, fitting, and finish that goes into the home you will actually live in or resell.</w:t>
-      </w:r>
-    </w:p>
-    <w:p>
-      <w:pPr>
-        <w:spacing w:after="160" w:line="276" w:lineRule="auto"/>
-      </w:pPr>
-      <w:r>
-        <w:rPr>
-          <w:rFonts w:ascii="Calibri" w:hAnsi="Calibri"/>
-          <w:b/>
-          <w:i w:val="0"/>
-          <w:color w:val="0F172A"/>
-          <w:sz w:val="22"/>
-        </w:rPr>
-        <w:t>Only nine units exist in this estate. This is the kind of scarcity that, in every comparable Abuja luxury corridor before it, has produced rapid post-completion price appreciation for whoever bought early.</w:t>
+        <w:t xml:space="preserve"> Sections 3 through 6 lay out exactly what has been spent, what remains to complete, and what margin that structure leaves you under each payment option.</w:t>
       </w:r>
     </w:p>
     <w:p/>
@@ -223,7 +208,7 @@
           <w:color w:val="0F172A"/>
           <w:sz w:val="26"/>
         </w:rPr>
-        <w:t>1. The Unit on Offer</w:t>
+        <w:t>1. The Unit and Site — As It Currently Stands</w:t>
       </w:r>
     </w:p>
     <w:tbl>
@@ -240,7 +225,7 @@
       <w:tr>
         <w:tc>
           <w:tcPr>
-            <w:tcW w:type="dxa" w:w="2880"/>
+            <w:tcW w:type="dxa" w:w="3024"/>
             <w:shd w:val="clear" w:color="auto" w:fill="1e293b"/>
           </w:tcPr>
           <w:p>
@@ -263,7 +248,7 @@
         </w:tc>
         <w:tc>
           <w:tcPr>
-            <w:tcW w:type="dxa" w:w="6624"/>
+            <w:tcW w:type="dxa" w:w="6480"/>
             <w:shd w:val="clear" w:color="auto" w:fill="1e293b"/>
           </w:tcPr>
           <w:p>
@@ -288,7 +273,7 @@
       <w:tr>
         <w:tc>
           <w:tcPr>
-            <w:tcW w:type="dxa" w:w="2880"/>
+            <w:tcW w:type="dxa" w:w="3024"/>
           </w:tcPr>
           <w:p>
             <w:r/>
@@ -302,7 +287,7 @@
         </w:tc>
         <w:tc>
           <w:tcPr>
-            <w:tcW w:type="dxa" w:w="6624"/>
+            <w:tcW w:type="dxa" w:w="6480"/>
           </w:tcPr>
           <w:p>
             <w:r/>
@@ -318,7 +303,7 @@
       <w:tr>
         <w:tc>
           <w:tcPr>
-            <w:tcW w:type="dxa" w:w="2880"/>
+            <w:tcW w:type="dxa" w:w="3024"/>
           </w:tcPr>
           <w:p>
             <w:r/>
@@ -332,7 +317,7 @@
         </w:tc>
         <w:tc>
           <w:tcPr>
-            <w:tcW w:type="dxa" w:w="6624"/>
+            <w:tcW w:type="dxa" w:w="6480"/>
           </w:tcPr>
           <w:p>
             <w:r/>
@@ -348,7 +333,7 @@
       <w:tr>
         <w:tc>
           <w:tcPr>
-            <w:tcW w:type="dxa" w:w="2880"/>
+            <w:tcW w:type="dxa" w:w="3024"/>
           </w:tcPr>
           <w:p>
             <w:r/>
@@ -362,7 +347,7 @@
         </w:tc>
         <w:tc>
           <w:tcPr>
-            <w:tcW w:type="dxa" w:w="6624"/>
+            <w:tcW w:type="dxa" w:w="6480"/>
           </w:tcPr>
           <w:p>
             <w:r/>
@@ -378,7 +363,7 @@
       <w:tr>
         <w:tc>
           <w:tcPr>
-            <w:tcW w:type="dxa" w:w="2880"/>
+            <w:tcW w:type="dxa" w:w="3024"/>
           </w:tcPr>
           <w:p>
             <w:r/>
@@ -386,13 +371,13 @@
               <w:rPr>
                 <w:sz w:val="19"/>
               </w:rPr>
-              <w:t>Built-up floor area</w:t>
+              <w:t>Built-up floor area (on completion)</w:t>
             </w:r>
           </w:p>
         </w:tc>
         <w:tc>
           <w:tcPr>
-            <w:tcW w:type="dxa" w:w="6624"/>
+            <w:tcW w:type="dxa" w:w="6480"/>
           </w:tcPr>
           <w:p>
             <w:r/>
@@ -408,7 +393,7 @@
       <w:tr>
         <w:tc>
           <w:tcPr>
-            <w:tcW w:type="dxa" w:w="2880"/>
+            <w:tcW w:type="dxa" w:w="3024"/>
           </w:tcPr>
           <w:p>
             <w:r/>
@@ -416,13 +401,13 @@
               <w:rPr>
                 <w:sz w:val="19"/>
               </w:rPr>
-              <w:t>Plot allocation</w:t>
+              <w:t>Total estate land</w:t>
             </w:r>
           </w:p>
         </w:tc>
         <w:tc>
           <w:tcPr>
-            <w:tcW w:type="dxa" w:w="6624"/>
+            <w:tcW w:type="dxa" w:w="6480"/>
           </w:tcPr>
           <w:p>
             <w:r/>
@@ -430,7 +415,7 @@
               <w:rPr>
                 <w:sz w:val="19"/>
               </w:rPr>
-              <w:t>Approx. 200 sqm serviced plot within the gated estate (balance is shared estate infrastructure)</w:t>
+              <w:t>2,147 sqm total. 30% (≈644 sqm) reserved for shared infrastructure and car park; remaining 70% (≈1,503 sqm) allocated across the 9 units — approx. 167 sqm average building plot per unit.</w:t>
             </w:r>
           </w:p>
         </w:tc>
@@ -438,7 +423,7 @@
       <w:tr>
         <w:tc>
           <w:tcPr>
-            <w:tcW w:type="dxa" w:w="2880"/>
+            <w:tcW w:type="dxa" w:w="3024"/>
           </w:tcPr>
           <w:p>
             <w:r/>
@@ -452,7 +437,7 @@
         </w:tc>
         <w:tc>
           <w:tcPr>
-            <w:tcW w:type="dxa" w:w="6624"/>
+            <w:tcW w:type="dxa" w:w="6480"/>
           </w:tcPr>
           <w:p>
             <w:r/>
@@ -460,7 +445,7 @@
               <w:rPr>
                 <w:sz w:val="19"/>
               </w:rPr>
-              <w:t>Carcass / unfinished — foundation, superstructure, block work, roofing structure, ring beam &amp; lintel complete. No plastering, painting, flooring, doors, windows, kitchen/bathroom fittings, or M&amp;E fixtures installed yet.</w:t>
+              <w:t>Pre-first-floor level — foundation and ground floor superstructure complete up to and including ground floor decking (suspended slab). No roofing yet. First floor construction, ring beam/lintel, roofing, and all finishing works have not yet commenced.</w:t>
             </w:r>
           </w:p>
         </w:tc>
@@ -468,7 +453,37 @@
       <w:tr>
         <w:tc>
           <w:tcPr>
-            <w:tcW w:type="dxa" w:w="2880"/>
+            <w:tcW w:type="dxa" w:w="3024"/>
+          </w:tcPr>
+          <w:p>
+            <w:r/>
+            <w:r>
+              <w:rPr>
+                <w:sz w:val="19"/>
+              </w:rPr>
+              <w:t>Perimeter/retaining fence</w:t>
+            </w:r>
+          </w:p>
+        </w:tc>
+        <w:tc>
+          <w:tcPr>
+            <w:tcW w:type="dxa" w:w="6480"/>
+          </w:tcPr>
+          <w:p>
+            <w:r/>
+            <w:r>
+              <w:rPr>
+                <w:sz w:val="19"/>
+              </w:rPr>
+              <w:t>Approximately 70% constructed estate-wide to date; remaining 30% outstanding.</w:t>
+            </w:r>
+          </w:p>
+        </w:tc>
+      </w:tr>
+      <w:tr>
+        <w:tc>
+          <w:tcPr>
+            <w:tcW w:type="dxa" w:w="3024"/>
           </w:tcPr>
           <w:p>
             <w:r/>
@@ -482,7 +497,7 @@
         </w:tc>
         <w:tc>
           <w:tcPr>
-            <w:tcW w:type="dxa" w:w="6624"/>
+            <w:tcW w:type="dxa" w:w="6480"/>
           </w:tcPr>
           <w:p>
             <w:r/>
@@ -503,6 +518,21 @@
     </w:p>
     <w:p>
       <w:pPr>
+        <w:spacing w:after="160" w:line="276" w:lineRule="auto"/>
+      </w:pPr>
+      <w:r>
+        <w:rPr>
+          <w:rFonts w:ascii="Calibri" w:hAnsi="Calibri"/>
+          <w:b w:val="0"/>
+          <w:i/>
+          <w:color w:val="555555"/>
+          <w:sz w:val="20"/>
+        </w:rPr>
+        <w:t>No inflation, no rounding in the buyer's favour — this is the stage you saw on site, stated plainly for the record in this document.</w:t>
+      </w:r>
+    </w:p>
+    <w:p>
+      <w:pPr>
         <w:spacing w:after="160"/>
       </w:pPr>
       <w:r>
@@ -512,7 +542,7 @@
           <w:color w:val="0F172A"/>
           <w:sz w:val="26"/>
         </w:rPr>
-        <w:t>2. Why an Unfinished Unit Is the Smarter Buy</w:t>
+        <w:t>2. Why This Works as a Build-and-Resell Position</w:t>
       </w:r>
     </w:p>
     <w:p>
@@ -527,7 +557,7 @@
           <w:color w:val="222222"/>
           <w:sz w:val="22"/>
         </w:rPr>
-        <w:t>Every finished luxury home you view already carries someone else's taste, someone else's tile choices, and a developer's finishing markup baked silently into the asking price. Buying at carcass stage removes all three problems at once.</w:t>
+        <w:t>Buying at pre-first-floor stage means you control 100% of the remaining construction spend — first floor, roof, and every finish — instead of paying a developer's finishing markup on someone else's decisions. Every naira you put into completion is a naira you control the specification and the supplier for.</w:t>
       </w:r>
     </w:p>
     <w:p>
@@ -542,7 +572,7 @@
           <w:color w:val="222222"/>
           <w:sz w:val="22"/>
         </w:rPr>
-        <w:t>•  You finish it exactly to your own specification, or your architect/interior designer's — no compromise on someone else's decisions.</w:t>
+        <w:t>•  You run your own completion contract at your own negotiated rates — no developer markup sits inside the remaining spend.</w:t>
       </w:r>
     </w:p>
     <w:p>
@@ -557,7 +587,7 @@
           <w:color w:val="222222"/>
           <w:sz w:val="22"/>
         </w:rPr>
-        <w:t>•  You avoid the developer's standard finishing margin entirely, because you commission your own finishing works directly.</w:t>
+        <w:t>•  You control the finish specification entirely, which matters directly to what you can resell it for and to whom.</w:t>
       </w:r>
     </w:p>
     <w:p>
@@ -572,7 +602,7 @@
           <w:color w:val="222222"/>
           <w:sz w:val="22"/>
         </w:rPr>
-        <w:t>•  You enter at a price materially below the completed market value of the exact same unit — the numbers in Section 4 show precisely how much lower.</w:t>
+        <w:t>•  The entry price is fixed now, before any further site progress or highway-driven appreciation moves the comparable market up.</w:t>
       </w:r>
     </w:p>
     <w:p/>
@@ -587,7 +617,7 @@
           <w:color w:val="0F172A"/>
           <w:sz w:val="26"/>
         </w:rPr>
-        <w:t>3. Actual Cost Breakdown — The Unfinished (Carcass) Unit</w:t>
+        <w:t>3. Actual Cost Breakdown — Spend to Date (Pre-First-Floor Stage)</w:t>
       </w:r>
     </w:p>
     <w:tbl>
@@ -625,7 +655,7 @@
                 <w:color w:val="222222"/>
                 <w:sz w:val="19"/>
               </w:rPr>
-              <w:t>This is the developer's actual incurred cost to bring this specific unit to its current carcass stage — land,</w:t>
+              <w:t>This is the actual cost incurred to bring this specific unit to its current pre-first-floor/decking stage —</w:t>
             </w:r>
           </w:p>
           <w:p>
@@ -637,7 +667,7 @@
                 <w:color w:val="222222"/>
                 <w:sz w:val="19"/>
               </w:rPr>
-              <w:t>structure, and site infrastructure only. It does NOT include any finishing, fittings, M&amp;E completion, developer</w:t>
+              <w:t>land, foundation, ground floor structure, and site infrastructure share only. It does NOT include first floor</w:t>
             </w:r>
           </w:p>
           <w:p>
@@ -649,7 +679,7 @@
                 <w:color w:val="222222"/>
                 <w:sz w:val="19"/>
               </w:rPr>
-              <w:t>margin, or market/location premium — those are addressed separately in Section 4.</w:t>
+              <w:t>construction, roofing, or any finishing — that remaining scope is costed separately in Section 4.</w:t>
             </w:r>
           </w:p>
           <w:p>
@@ -673,7 +703,7 @@
                 <w:color w:val="222222"/>
                 <w:sz w:val="19"/>
               </w:rPr>
-              <w:t>proposal is shown to any buyer — treat these as a defensible starting figure, not yet a reconciled audit.</w:t>
+              <w:t>proposal is finalized — treat these as a defensible starting figure, not yet a reconciled audit.</w:t>
             </w:r>
           </w:p>
         </w:tc>
@@ -768,7 +798,7 @@
               <w:rPr>
                 <w:sz w:val="19"/>
               </w:rPr>
-              <w:t>₦55,000,000</w:t>
+              <w:t>₦52,000,000</w:t>
             </w:r>
           </w:p>
         </w:tc>
@@ -798,7 +828,7 @@
               <w:rPr>
                 <w:sz w:val="19"/>
               </w:rPr>
-              <w:t>₦18,500,000</w:t>
+              <w:t>₦19,000,000</w:t>
             </w:r>
           </w:p>
         </w:tc>
@@ -814,7 +844,7 @@
               <w:rPr>
                 <w:sz w:val="19"/>
               </w:rPr>
-              <w:t>Superstructure — block work &amp; structural framing (blocks, cement, reinforcement, columns, beams)</w:t>
+              <w:t>Ground floor superstructure — block work &amp; structural framing (blocks, cement, reinforcement, columns, beams)</w:t>
             </w:r>
           </w:p>
         </w:tc>
@@ -828,7 +858,7 @@
               <w:rPr>
                 <w:sz w:val="19"/>
               </w:rPr>
-              <w:t>₦42,000,000</w:t>
+              <w:t>₦24,000,000</w:t>
             </w:r>
           </w:p>
         </w:tc>
@@ -844,7 +874,7 @@
               <w:rPr>
                 <w:sz w:val="19"/>
               </w:rPr>
-              <w:t>Roofing structure &amp; carcass roofing (trusses, structural roofing sheets — no ceiling finish)</w:t>
+              <w:t>Ground floor decking — suspended slab (formwork, reinforcement, concrete casting)</w:t>
             </w:r>
           </w:p>
         </w:tc>
@@ -858,7 +888,7 @@
               <w:rPr>
                 <w:sz w:val="19"/>
               </w:rPr>
-              <w:t>₦21,500,000</w:t>
+              <w:t>₦17,000,000</w:t>
             </w:r>
           </w:p>
         </w:tc>
@@ -874,7 +904,7 @@
               <w:rPr>
                 <w:sz w:val="19"/>
               </w:rPr>
-              <w:t>Ring beam, lintel &amp; structural concrete works</w:t>
+              <w:t>Ground floor rough-in electrical &amp; plumbing (conduits/pipe routing embedded ahead of decking)</w:t>
             </w:r>
           </w:p>
         </w:tc>
@@ -888,7 +918,7 @@
               <w:rPr>
                 <w:sz w:val="19"/>
               </w:rPr>
-              <w:t>₦14,000,000</w:t>
+              <w:t>₦6,500,000</w:t>
             </w:r>
           </w:p>
         </w:tc>
@@ -904,7 +934,7 @@
               <w:rPr>
                 <w:sz w:val="19"/>
               </w:rPr>
-              <w:t>Rough-in electrical &amp; plumbing (conduits, pipe routing only — no fixtures)</w:t>
+              <w:t>Retaining perimeter fence — unit share of the 70% estate-wide construction completed to date</w:t>
             </w:r>
           </w:p>
         </w:tc>
@@ -934,7 +964,37 @@
               <w:rPr>
                 <w:sz w:val="19"/>
               </w:rPr>
-              <w:t>Door/window structural openings (openings only — no frames or glazing yet)</w:t>
+              <w:t>Other shared site infrastructure to date (drainage, highway access tie-in works in progress)</w:t>
+            </w:r>
+          </w:p>
+        </w:tc>
+        <w:tc>
+          <w:tcPr>
+            <w:tcW w:type="dxa" w:w="2448"/>
+          </w:tcPr>
+          <w:p>
+            <w:r/>
+            <w:r>
+              <w:rPr>
+                <w:sz w:val="19"/>
+              </w:rPr>
+              <w:t>₦6,000,000</w:t>
+            </w:r>
+          </w:p>
+        </w:tc>
+      </w:tr>
+      <w:tr>
+        <w:tc>
+          <w:tcPr>
+            <w:tcW w:type="dxa" w:w="7056"/>
+          </w:tcPr>
+          <w:p>
+            <w:r/>
+            <w:r>
+              <w:rPr>
+                <w:sz w:val="19"/>
+              </w:rPr>
+              <w:t>Professional fees &amp; site supervision (foundation through decking phase)</w:t>
             </w:r>
           </w:p>
         </w:tc>
@@ -964,7 +1024,7 @@
               <w:rPr>
                 <w:sz w:val="19"/>
               </w:rPr>
-              <w:t>Site infrastructure share (highway access tie-in, perimeter wall/gate, drainage)</w:t>
+              <w:t>Contingency (~5%)</w:t>
             </w:r>
           </w:p>
         </w:tc>
@@ -978,67 +1038,7 @@
               <w:rPr>
                 <w:sz w:val="19"/>
               </w:rPr>
-              <w:t>₦16,500,000</w:t>
-            </w:r>
-          </w:p>
-        </w:tc>
-      </w:tr>
-      <w:tr>
-        <w:tc>
-          <w:tcPr>
-            <w:tcW w:type="dxa" w:w="7056"/>
-          </w:tcPr>
-          <w:p>
-            <w:r/>
-            <w:r>
-              <w:rPr>
-                <w:sz w:val="19"/>
-              </w:rPr>
-              <w:t>Professional fees &amp; site supervision (carcass phase only)</w:t>
-            </w:r>
-          </w:p>
-        </w:tc>
-        <w:tc>
-          <w:tcPr>
-            <w:tcW w:type="dxa" w:w="2448"/>
-          </w:tcPr>
-          <w:p>
-            <w:r/>
-            <w:r>
-              <w:rPr>
-                <w:sz w:val="19"/>
-              </w:rPr>
-              <w:t>₦8,000,000</w:t>
-            </w:r>
-          </w:p>
-        </w:tc>
-      </w:tr>
-      <w:tr>
-        <w:tc>
-          <w:tcPr>
-            <w:tcW w:type="dxa" w:w="7056"/>
-          </w:tcPr>
-          <w:p>
-            <w:r/>
-            <w:r>
-              <w:rPr>
-                <w:sz w:val="19"/>
-              </w:rPr>
-              <w:t>Contingency (carcass phase, ~5%)</w:t>
-            </w:r>
-          </w:p>
-        </w:tc>
-        <w:tc>
-          <w:tcPr>
-            <w:tcW w:type="dxa" w:w="2448"/>
-          </w:tcPr>
-          <w:p>
-            <w:r/>
-            <w:r>
-              <w:rPr>
-                <w:sz w:val="19"/>
-              </w:rPr>
-              <w:t>₦9,000,000</w:t>
+              <w:t>₦7,000,000</w:t>
             </w:r>
           </w:p>
         </w:tc>
@@ -1057,7 +1057,7 @@
                 <w:color w:val="B8860B"/>
                 <w:sz w:val="19"/>
               </w:rPr>
-              <w:t>TOTAL ACTUAL COST — UNFINISHED UNIT</w:t>
+              <w:t>TOTAL ACTUAL COST TO DATE</w:t>
             </w:r>
           </w:p>
         </w:tc>
@@ -1074,7 +1074,7 @@
                 <w:color w:val="B8860B"/>
                 <w:sz w:val="19"/>
               </w:rPr>
-              <w:t>₦203,000,000</w:t>
+              <w:t>₦150,000,000</w:t>
             </w:r>
           </w:p>
         </w:tc>
@@ -1097,7 +1097,7 @@
           <w:color w:val="555555"/>
           <w:sz w:val="20"/>
         </w:rPr>
-        <w:t>This figure is consistent with prevailing Katampe market reality: even a base-specification carcass / lintel-roofed unfinished terrace unit in this corridor costs no less than ₦200,000,000 to bring to this stage. At ₦203,000,000, this unit sits right at that market floor despite being a full 4-bedroom luxury terrace duplex with direct highway frontage — the actual cost is realistic and defensible, not inflated.</w:t>
+        <w:t>For reference, a carcass/lintel-roofed unfinished terrace unit in this corridor — a later, more advanced stage than this one — costs no less than ₦200,000,000 to reach that point. At ₦150,000,000, this unit's cost is proportionately lower, which is exactly consistent with its earlier pre-first-floor, pre-roofing stage — not a discrepancy, a confirmation.</w:t>
       </w:r>
     </w:p>
     <w:p>
@@ -1111,7 +1111,7 @@
           <w:color w:val="0F172A"/>
           <w:sz w:val="26"/>
         </w:rPr>
-        <w:t>4. Precise Valuation — The Same Unit, Fully Finished</w:t>
+        <w:t>4. Remaining Completion Cost &amp; Finished Resale Valuation</w:t>
       </w:r>
     </w:p>
     <w:tbl>
@@ -1149,7 +1149,7 @@
                 <w:color w:val="222222"/>
                 <w:sz w:val="19"/>
               </w:rPr>
-              <w:t>This bridges the actual carcass cost above to the ₦450,000,000 completed market valuation. 'Completion cost' is</w:t>
+              <w:t>This bridges the ₦150,000,000 spent to date to the ₦450,000,000 finished resale valuation. 'Completion cost' is</w:t>
             </w:r>
           </w:p>
           <w:p>
@@ -1161,7 +1161,7 @@
                 <w:color w:val="222222"/>
                 <w:sz w:val="19"/>
               </w:rPr>
-              <w:t>what it would cost the developer to finish the unit to full luxury spec (plastering, paint, flooring, kitchen,</w:t>
+              <w:t>what it takes to carry the unit from pre-first-floor stage through first floor structure, roofing, ring</w:t>
             </w:r>
           </w:p>
           <w:p>
@@ -1173,7 +1173,7 @@
                 <w:color w:val="222222"/>
                 <w:sz w:val="19"/>
               </w:rPr>
-              <w:t>bathroom fittings, doors, windows, electrical/plumbing fixtures, landscaping share). 'Location &amp; market premium'</w:t>
+              <w:t>beam/lintel, doors/windows, full interior finishing, kitchen/bathroom fittings, remaining fence share, and</w:t>
             </w:r>
           </w:p>
           <w:p>
@@ -1185,7 +1185,7 @@
                 <w:color w:val="222222"/>
                 <w:sz w:val="19"/>
               </w:rPr>
-              <w:t>reflects genuine comparable luxury terrace pricing along this corridor since the highway's completion — it is a</w:t>
+              <w:t>landscaping. 'Location &amp; market premium' reflects genuine comparable luxury terrace pricing along this</w:t>
             </w:r>
           </w:p>
           <w:p>
@@ -1197,7 +1197,7 @@
                 <w:color w:val="222222"/>
                 <w:sz w:val="19"/>
               </w:rPr>
-              <w:t>market-based figure, not an arbitrary markup.</w:t>
+              <w:t>corridor since the highway's completion — a market-based figure, not an arbitrary markup.</w:t>
             </w:r>
           </w:p>
         </w:tc>
@@ -1278,7 +1278,7 @@
               <w:rPr>
                 <w:sz w:val="19"/>
               </w:rPr>
-              <w:t>Actual carcass cost (from Section 3)</w:t>
+              <w:t>Actual cost to date (from Section 3)</w:t>
             </w:r>
           </w:p>
         </w:tc>
@@ -1292,7 +1292,7 @@
               <w:rPr>
                 <w:sz w:val="19"/>
               </w:rPr>
-              <w:t>₦203,000,000</w:t>
+              <w:t>₦150,000,000</w:t>
             </w:r>
           </w:p>
         </w:tc>
@@ -1308,7 +1308,7 @@
               <w:rPr>
                 <w:sz w:val="19"/>
               </w:rPr>
-              <w:t>Completion cost to full luxury finish (interior finishing, M&amp;E fit-out, kitchen/bathroom fittings, landscaping share)</w:t>
+              <w:t>Completion cost to full luxury finish (first floor structure, roofing, ring beam/lintel, doors/windows, interior finishing, kitchen/bathroom fittings, fence completion, landscaping)</w:t>
             </w:r>
           </w:p>
         </w:tc>
@@ -1322,7 +1322,7 @@
               <w:rPr>
                 <w:sz w:val="19"/>
               </w:rPr>
-              <w:t>₦75,000,000</w:t>
+              <w:t>₦95,000,000</w:t>
             </w:r>
           </w:p>
         </w:tc>
@@ -1338,7 +1338,7 @@
               <w:rPr>
                 <w:sz w:val="19"/>
               </w:rPr>
-              <w:t>Subtotal — full all-in development cost if completed by the developer</w:t>
+              <w:t>Subtotal — full all-in cost to complete</w:t>
             </w:r>
           </w:p>
         </w:tc>
@@ -1352,7 +1352,7 @@
               <w:rPr>
                 <w:sz w:val="19"/>
               </w:rPr>
-              <w:t>₦278,000,000</w:t>
+              <w:t>₦245,000,000</w:t>
             </w:r>
           </w:p>
         </w:tc>
@@ -1382,7 +1382,7 @@
               <w:rPr>
                 <w:sz w:val="19"/>
               </w:rPr>
-              <w:t>₦172,000,000</w:t>
+              <w:t>₦205,000,000</w:t>
             </w:r>
           </w:p>
         </w:tc>
@@ -1401,7 +1401,7 @@
                 <w:color w:val="B8860B"/>
                 <w:sz w:val="19"/>
               </w:rPr>
-              <w:t>FINISHED MARKET VALUATION — PER UNIT</w:t>
+              <w:t>FINISHED RESALE VALUATION — PER UNIT</w:t>
             </w:r>
           </w:p>
         </w:tc>
@@ -1419,6 +1419,88 @@
                 <w:sz w:val="19"/>
               </w:rPr>
               <w:t>₦450,000,000</w:t>
+            </w:r>
+          </w:p>
+        </w:tc>
+      </w:tr>
+    </w:tbl>
+    <w:p>
+      <w:pPr>
+        <w:spacing w:after="80"/>
+      </w:pPr>
+    </w:p>
+    <w:tbl>
+      <w:tblPr>
+        <w:tblW w:type="auto" w:w="0"/>
+        <w:jc w:val="center"/>
+        <w:tblLook w:firstColumn="1" w:firstRow="1" w:lastColumn="0" w:lastRow="0" w:noHBand="0" w:noVBand="1" w:val="04A0"/>
+      </w:tblPr>
+      <w:tblGrid>
+        <w:gridCol w:w="8640"/>
+      </w:tblGrid>
+      <w:tr>
+        <w:tc>
+          <w:tcPr>
+            <w:tcW w:type="dxa" w:w="8640"/>
+            <w:shd w:val="clear" w:color="auto" w:fill="F2ECD9"/>
+          </w:tcPr>
+          <w:p>
+            <w:r/>
+            <w:r>
+              <w:rPr>
+                <w:b/>
+                <w:color w:val="8A6A00"/>
+                <w:sz w:val="20"/>
+              </w:rPr>
+              <w:t>COMPLETION SCOPE BREAKDOWN (the ₦95,000,000 above)</w:t>
+            </w:r>
+          </w:p>
+          <w:p>
+            <w:pPr>
+              <w:spacing w:after="40"/>
+            </w:pPr>
+            <w:r>
+              <w:rPr>
+                <w:color w:val="222222"/>
+                <w:sz w:val="19"/>
+              </w:rPr>
+              <w:t>First floor superstructure (block work &amp; framing): ₦16,000,000  |  Roofing structure &amp; covering: ₦18,000,000</w:t>
+            </w:r>
+          </w:p>
+          <w:p>
+            <w:pPr>
+              <w:spacing w:after="40"/>
+            </w:pPr>
+            <w:r>
+              <w:rPr>
+                <w:color w:val="222222"/>
+                <w:sz w:val="19"/>
+              </w:rPr>
+              <w:t>Ring beam &amp; lintel: ₦7,000,000  |  Doors, windows &amp; fenestration: ₦9,000,000</w:t>
+            </w:r>
+          </w:p>
+          <w:p>
+            <w:pPr>
+              <w:spacing w:after="40"/>
+            </w:pPr>
+            <w:r>
+              <w:rPr>
+                <w:color w:val="222222"/>
+                <w:sz w:val="19"/>
+              </w:rPr>
+              <w:t>Interior finishing (plastering, POP, paint, flooring/tiling): ₦18,000,000  |  Kitchen &amp; bathroom fittings: ₦10,000,000</w:t>
+            </w:r>
+          </w:p>
+          <w:p>
+            <w:pPr>
+              <w:spacing w:after="40"/>
+            </w:pPr>
+            <w:r>
+              <w:rPr>
+                <w:color w:val="222222"/>
+                <w:sz w:val="19"/>
+              </w:rPr>
+              <w:t>Remaining electrical &amp; plumbing completion: ₦7,000,000  |  Fence completion (remaining 30%) &amp; landscaping: ₦10,000,000</w:t>
             </w:r>
           </w:p>
         </w:tc>
@@ -1454,7 +1536,7 @@
           <w:color w:val="222222"/>
           <w:sz w:val="22"/>
         </w:rPr>
-        <w:t xml:space="preserve">The standing offer price for this unfinished unit is </w:t>
+        <w:t xml:space="preserve">The standing offer price for this unit at its current stage is </w:t>
       </w:r>
       <w:r>
         <w:rPr>
@@ -1490,7 +1572,7 @@
           <w:color w:val="222222"/>
           <w:sz w:val="22"/>
         </w:rPr>
-        <w:t xml:space="preserve"> the ₦450,000,000 completed market valuation established in Section 4. That gap alone is the headline reason this offer works: no comparable finished unit in this corridor trades anywhere near ₦350M.</w:t>
+        <w:t xml:space="preserve"> the ₦450,000,000 finished resale valuation established in Section 4. That gap is the headline number: no comparable finished unit in this corridor trades anywhere near ₦350M.</w:t>
       </w:r>
     </w:p>
     <w:p>
@@ -1504,25 +1586,7 @@
           <w:color w:val="222222"/>
           <w:sz w:val="22"/>
         </w:rPr>
-        <w:t xml:space="preserve">But the real number that matters to you as a buyer is what happens after you finish it yourself. Completing this unit to full luxury spec costs approximately </w:t>
-      </w:r>
-      <w:r>
-        <w:rPr>
-          <w:rFonts w:ascii="Calibri" w:hAnsi="Calibri"/>
-          <w:b/>
-          <w:color w:val="222222"/>
-          <w:sz w:val="22"/>
-        </w:rPr>
-        <w:t>₦75,000,000</w:t>
-      </w:r>
-      <w:r>
-        <w:rPr>
-          <w:rFonts w:ascii="Calibri" w:hAnsi="Calibri"/>
-          <w:b w:val="0"/>
-          <w:color w:val="222222"/>
-          <w:sz w:val="22"/>
-        </w:rPr>
-        <w:t xml:space="preserve"> (Section 4). Add that to the </w:t>
+        <w:t xml:space="preserve">Run it as a build-and-resell position: purchase price of </w:t>
       </w:r>
       <w:r>
         <w:rPr>
@@ -1540,7 +1604,7 @@
           <w:color w:val="222222"/>
           <w:sz w:val="22"/>
         </w:rPr>
-        <w:t xml:space="preserve"> purchase price and your total all-in cost is </w:t>
+        <w:t xml:space="preserve"> plus completion cost of </w:t>
       </w:r>
       <w:r>
         <w:rPr>
@@ -1549,7 +1613,7 @@
           <w:color w:val="222222"/>
           <w:sz w:val="22"/>
         </w:rPr>
-        <w:t>₦425,000,000</w:t>
+        <w:t>₦95,000,000</w:t>
       </w:r>
       <w:r>
         <w:rPr>
@@ -1558,7 +1622,25 @@
           <w:color w:val="222222"/>
           <w:sz w:val="22"/>
         </w:rPr>
-        <w:t xml:space="preserve"> — against a completed market value of </w:t>
+        <w:t xml:space="preserve"> (Section 4) puts your all-in cost at </w:t>
+      </w:r>
+      <w:r>
+        <w:rPr>
+          <w:rFonts w:ascii="Calibri" w:hAnsi="Calibri"/>
+          <w:b/>
+          <w:color w:val="222222"/>
+          <w:sz w:val="22"/>
+        </w:rPr>
+        <w:t>₦445,000,000</w:t>
+      </w:r>
+      <w:r>
+        <w:rPr>
+          <w:rFonts w:ascii="Calibri" w:hAnsi="Calibri"/>
+          <w:b w:val="0"/>
+          <w:color w:val="222222"/>
+          <w:sz w:val="22"/>
+        </w:rPr>
+        <w:t xml:space="preserve">. Against a </w:t>
       </w:r>
       <w:r>
         <w:rPr>
@@ -1576,25 +1658,7 @@
           <w:color w:val="222222"/>
           <w:sz w:val="22"/>
         </w:rPr>
-        <w:t xml:space="preserve">. That is </w:t>
-      </w:r>
-      <w:r>
-        <w:rPr>
-          <w:rFonts w:ascii="Calibri" w:hAnsi="Calibri"/>
-          <w:b/>
-          <w:color w:val="222222"/>
-          <w:sz w:val="22"/>
-        </w:rPr>
-        <w:t>₦25,000,000 of built-in equity</w:t>
-      </w:r>
-      <w:r>
-        <w:rPr>
-          <w:rFonts w:ascii="Calibri" w:hAnsi="Calibri"/>
-          <w:b w:val="0"/>
-          <w:color w:val="222222"/>
-          <w:sz w:val="22"/>
-        </w:rPr>
-        <w:t xml:space="preserve"> the moment you finish the build, before any further market appreciation from the highway completion is even factored in.</w:t>
+        <w:t xml:space="preserve"> finished resale valuation, that already clears your build cost with room to spare — before any further market movement from the highway's continued impact on this corridor.</w:t>
       </w:r>
     </w:p>
     <w:p>
@@ -1609,7 +1673,7 @@
           <w:color w:val="222222"/>
           <w:sz w:val="22"/>
         </w:rPr>
-        <w:t>From the seller's side, this price is disciplined, not arbitrary: it recovers the full ₦203,000,000 actually invested in land and structure, plus a development margin of ₦147,000,000 — proportionate to a project that sits directly on a newly built highway in one of Abuja's most closely watched luxury corridors, and nowhere close to the ₦450,000,000 ceiling the finished product commands.</w:t>
+        <w:t>From the seller's side, this price recovers the full ₦150,000,000 actually invested in land and structure to date, plus a development margin of ₦200,000,000 — proportionate to a project sitting directly on a newly built highway in one of Abuja's most closely watched luxury corridors, and still well below the ₦450,000,000 ceiling the finished product commands.</w:t>
       </w:r>
     </w:p>
     <w:p>
@@ -1623,7 +1687,7 @@
           <w:color w:val="0F172A"/>
           <w:sz w:val="26"/>
         </w:rPr>
-        <w:t>6. Payment Options — A Special Buyer Incentive</w:t>
+        <w:t>6. Payment Options</w:t>
       </w:r>
     </w:p>
     <w:tbl>
@@ -1697,7 +1761,7 @@
                 <w:color w:val="222222"/>
                 <w:sz w:val="19"/>
               </w:rPr>
-              <w:t>days. Neither option is priced above the standing offer price — Option A is simply the discounted cash route,</w:t>
+              <w:t>days. Neither option is priced above the standing offer price — Option A is the discounted cash route, Option</w:t>
             </w:r>
           </w:p>
           <w:p>
@@ -1709,7 +1773,7 @@
                 <w:color w:val="222222"/>
                 <w:sz w:val="19"/>
               </w:rPr>
-              <w:t>Option B is the full-price installment route.</w:t>
+              <w:t>B is the full-price installment route.</w:t>
             </w:r>
           </w:p>
         </w:tc>
@@ -1908,7 +1972,7 @@
           <w:color w:val="222222"/>
           <w:sz w:val="22"/>
         </w:rPr>
-        <w:t xml:space="preserve">Under Option A, your total all-in cost — purchase price plus completion — is </w:t>
+        <w:t xml:space="preserve">Under Option A, your all-in cost to complete and hold — purchase price plus completion — is </w:t>
       </w:r>
       <w:r>
         <w:rPr>
@@ -1917,7 +1981,7 @@
           <w:color w:val="222222"/>
           <w:sz w:val="22"/>
         </w:rPr>
-        <w:t>₦375,000,000</w:t>
+        <w:t>₦395,000,000</w:t>
       </w:r>
       <w:r>
         <w:rPr>
@@ -1926,7 +1990,7 @@
           <w:color w:val="222222"/>
           <w:sz w:val="22"/>
         </w:rPr>
-        <w:t xml:space="preserve"> against a ₦450,000,000 finished valuation: </w:t>
+        <w:t xml:space="preserve"> against a ₦450,000,000 finished resale valuation: </w:t>
       </w:r>
       <w:r>
         <w:rPr>
@@ -1935,7 +1999,7 @@
           <w:color w:val="222222"/>
           <w:sz w:val="22"/>
         </w:rPr>
-        <w:t>₦75,000,000 in immediate built-in equity.</w:t>
+        <w:t>₦55,000,000 in margin</w:t>
       </w:r>
       <w:r>
         <w:rPr>
@@ -1944,7 +2008,7 @@
           <w:color w:val="222222"/>
           <w:sz w:val="22"/>
         </w:rPr>
-        <w:t xml:space="preserve"> Under Option B, your all-in cost is </w:t>
+        <w:t xml:space="preserve"> before you even market the finished unit. Under Option B, your all-in cost is </w:t>
       </w:r>
       <w:r>
         <w:rPr>
@@ -1953,7 +2017,7 @@
           <w:color w:val="222222"/>
           <w:sz w:val="22"/>
         </w:rPr>
-        <w:t>₦425,000,000</w:t>
+        <w:t>₦445,000,000</w:t>
       </w:r>
       <w:r>
         <w:rPr>
@@ -1962,25 +2026,7 @@
           <w:color w:val="222222"/>
           <w:sz w:val="22"/>
         </w:rPr>
-        <w:t xml:space="preserve">, still </w:t>
-      </w:r>
-      <w:r>
-        <w:rPr>
-          <w:rFonts w:ascii="Calibri" w:hAnsi="Calibri"/>
-          <w:b/>
-          <w:color w:val="222222"/>
-          <w:sz w:val="22"/>
-        </w:rPr>
-        <w:t>₦25,000,000 below finished market value</w:t>
-      </w:r>
-      <w:r>
-        <w:rPr>
-          <w:rFonts w:ascii="Calibri" w:hAnsi="Calibri"/>
-          <w:b w:val="0"/>
-          <w:color w:val="222222"/>
-          <w:sz w:val="22"/>
-        </w:rPr>
-        <w:t xml:space="preserve"> — before the estate's own post-highway appreciation is even counted.</w:t>
+        <w:t xml:space="preserve"> — margin is tighter at this stage, but the two-payment structure preserves your working capital for the completion works themselves, which for a build-and-resell run is often the more useful trade-off.</w:t>
       </w:r>
     </w:p>
     <w:p>
@@ -2009,7 +2055,7 @@
           <w:color w:val="222222"/>
           <w:sz w:val="22"/>
         </w:rPr>
-        <w:t>•  Only nine units exist in the entire Katamkpe estate — this is not a phased development with hundreds of future units diluting scarcity.</w:t>
+        <w:t>•  This is a fixed entry price at a fixed, verifiable construction stage — you priced the remaining work yourself on your site visit, so you know exactly what you are taking on.</w:t>
       </w:r>
     </w:p>
     <w:p>
@@ -2024,7 +2070,7 @@
           <w:color w:val="222222"/>
           <w:sz w:val="22"/>
         </w:rPr>
-        <w:t>•  The 4-lane super highway is newly completed, not newly announced — the value driver is already in the ground, not a promise on a masterplan.</w:t>
+        <w:t>•  The 4-lane super highway is already built, not proposed — the value driver behind the ₦450,000,000 resale comp is already in the ground.</w:t>
       </w:r>
     </w:p>
     <w:p>
@@ -2039,7 +2085,7 @@
           <w:color w:val="222222"/>
           <w:sz w:val="22"/>
         </w:rPr>
-        <w:t>•  Carcass-stage entry pricing like this closes the moment finishing work begins on any unit — once finishing starts, pricing moves to completed-unit valuation.</w:t>
+        <w:t>•  Entry pricing at this pre-first-floor stage closes once first floor construction begins — pricing moves to a higher completion-stage basis from that point.</w:t>
       </w:r>
     </w:p>
     <w:p>
@@ -2054,7 +2100,7 @@
           <w:color w:val="222222"/>
           <w:sz w:val="22"/>
         </w:rPr>
-        <w:t>•  The ₦300,000,000 discounted cash price under Option A is a decisive-buyer incentive only — it is available now, not indefinitely, and reverts to the ₦350,000,000 standing offer price (Option B terms) once this window closes.</w:t>
+        <w:t>•  The ₦300,000,000 discounted cash price under Option A is available now, not indefinitely, and reverts to the ₦350,000,000 standing price (Option B terms) once this window closes.</w:t>
       </w:r>
     </w:p>
     <w:p/>
@@ -2083,7 +2129,7 @@
           <w:color w:val="222222"/>
           <w:sz w:val="22"/>
         </w:rPr>
-        <w:t>This proposal is offered in good faith, as a personal courtesy through AVM Monday Riku Morgan (Rtd), before this unit is offered any further. We welcome a site visit at your convenience — with AVM Morgan or independently — to inspect the unit, the estate, and the highway frontage firsthand before proceeding.</w:t>
+        <w:t>This proposal is offered in good faith, as a personal courtesy through AVM Monday Riku Morgan (Rtd), before this unit is offered any further. Given your site visit and construction background, we're glad to sit down and walk through the completion scope and figures in more detail whenever useful — with AVM Morgan or independently.</w:t>
       </w:r>
     </w:p>
     <w:p>

</xml_diff>

<commit_message>
Rework Katamkpe cost breakdown to tie to known 150M/9-unit total (50M per unit); shift pricing logic from cost-recovery to market/finished-value based
</commit_message>
<xml_diff>
--- a/documents_aug2026/katamkpe_project/KATAMKPE_TERRACE_UNIT_BUYER_PROPOSAL.docx
+++ b/documents_aug2026/katamkpe_project/KATAMKPE_TERRACE_UNIT_BUYER_PROPOSAL.docx
@@ -655,7 +655,7 @@
                 <w:color w:val="222222"/>
                 <w:sz w:val="19"/>
               </w:rPr>
-              <w:t>This is the actual cost incurred to bring this specific unit to its current pre-first-floor/decking stage —</w:t>
+              <w:t>You already know the number that matters most here: total construction spend across all 9 units to date is</w:t>
             </w:r>
           </w:p>
           <w:p>
@@ -667,7 +667,7 @@
                 <w:color w:val="222222"/>
                 <w:sz w:val="19"/>
               </w:rPr>
-              <w:t>land, foundation, ground floor structure, and site infrastructure share only. It does NOT include first floor</w:t>
+              <w:t>₦150,000,000. This table simply shows this unit's honest share of that figure, plus its share of land — nothing</w:t>
             </w:r>
           </w:p>
           <w:p>
@@ -679,7 +679,7 @@
                 <w:color w:val="222222"/>
                 <w:sz w:val="19"/>
               </w:rPr>
-              <w:t>construction, roofing, or any finishing — that remaining scope is costed separately in Section 4.</w:t>
+              <w:t>hidden, nothing inflated. This is deliberately the smaller, less important number in this proposal. The offer</w:t>
             </w:r>
           </w:p>
           <w:p>
@@ -691,7 +691,7 @@
                 <w:color w:val="222222"/>
                 <w:sz w:val="19"/>
               </w:rPr>
-              <w:t>Figures are working construction-cost estimates for Tom's review against real site invoices/receipts before this</w:t>
+              <w:t>price in Section 5 is NOT built off this cost figure — it's anchored to comparable market and finished resale</w:t>
             </w:r>
           </w:p>
           <w:p>
@@ -703,7 +703,7 @@
                 <w:color w:val="222222"/>
                 <w:sz w:val="19"/>
               </w:rPr>
-              <w:t>proposal is finalized — treat these as a defensible starting figure, not yet a reconciled audit.</w:t>
+              <w:t>values, which is where the real pricing logic sits.</w:t>
             </w:r>
           </w:p>
         </w:tc>
@@ -784,7 +784,7 @@
               <w:rPr>
                 <w:sz w:val="19"/>
               </w:rPr>
-              <w:t>Land acquisition &amp; allocation (unit share, title/survey/C of O processing)</w:t>
+              <w:t>Total construction spend to date, all 9 units (pre-first-floor stage, estate-wide)</w:t>
             </w:r>
           </w:p>
         </w:tc>
@@ -798,7 +798,7 @@
               <w:rPr>
                 <w:sz w:val="19"/>
               </w:rPr>
-              <w:t>₦52,000,000</w:t>
+              <w:t>₦150,000,000</w:t>
             </w:r>
           </w:p>
         </w:tc>
@@ -814,7 +814,7 @@
               <w:rPr>
                 <w:sz w:val="19"/>
               </w:rPr>
-              <w:t>Site preparation &amp; foundation (clearing, excavation, foundation concrete, DPC)</w:t>
+              <w:t>This unit's proportional share (₦150,000,000 ÷ 9 units)</w:t>
             </w:r>
           </w:p>
         </w:tc>
@@ -828,7 +828,7 @@
               <w:rPr>
                 <w:sz w:val="19"/>
               </w:rPr>
-              <w:t>₦19,000,000</w:t>
+              <w:t>₦16,700,000</w:t>
             </w:r>
           </w:p>
         </w:tc>
@@ -844,7 +844,7 @@
               <w:rPr>
                 <w:sz w:val="19"/>
               </w:rPr>
-              <w:t>Ground floor superstructure — block work &amp; structural framing (blocks, cement, reinforcement, columns, beams)</w:t>
+              <w:t>Land acquisition &amp; allocation — this unit's share (title/survey/C of O processing)</w:t>
             </w:r>
           </w:p>
         </w:tc>
@@ -858,187 +858,7 @@
               <w:rPr>
                 <w:sz w:val="19"/>
               </w:rPr>
-              <w:t>₦24,000,000</w:t>
-            </w:r>
-          </w:p>
-        </w:tc>
-      </w:tr>
-      <w:tr>
-        <w:tc>
-          <w:tcPr>
-            <w:tcW w:type="dxa" w:w="7056"/>
-          </w:tcPr>
-          <w:p>
-            <w:r/>
-            <w:r>
-              <w:rPr>
-                <w:sz w:val="19"/>
-              </w:rPr>
-              <w:t>Ground floor decking — suspended slab (formwork, reinforcement, concrete casting)</w:t>
-            </w:r>
-          </w:p>
-        </w:tc>
-        <w:tc>
-          <w:tcPr>
-            <w:tcW w:type="dxa" w:w="2448"/>
-          </w:tcPr>
-          <w:p>
-            <w:r/>
-            <w:r>
-              <w:rPr>
-                <w:sz w:val="19"/>
-              </w:rPr>
-              <w:t>₦17,000,000</w:t>
-            </w:r>
-          </w:p>
-        </w:tc>
-      </w:tr>
-      <w:tr>
-        <w:tc>
-          <w:tcPr>
-            <w:tcW w:type="dxa" w:w="7056"/>
-          </w:tcPr>
-          <w:p>
-            <w:r/>
-            <w:r>
-              <w:rPr>
-                <w:sz w:val="19"/>
-              </w:rPr>
-              <w:t>Ground floor rough-in electrical &amp; plumbing (conduits/pipe routing embedded ahead of decking)</w:t>
-            </w:r>
-          </w:p>
-        </w:tc>
-        <w:tc>
-          <w:tcPr>
-            <w:tcW w:type="dxa" w:w="2448"/>
-          </w:tcPr>
-          <w:p>
-            <w:r/>
-            <w:r>
-              <w:rPr>
-                <w:sz w:val="19"/>
-              </w:rPr>
-              <w:t>₦6,500,000</w:t>
-            </w:r>
-          </w:p>
-        </w:tc>
-      </w:tr>
-      <w:tr>
-        <w:tc>
-          <w:tcPr>
-            <w:tcW w:type="dxa" w:w="7056"/>
-          </w:tcPr>
-          <w:p>
-            <w:r/>
-            <w:r>
-              <w:rPr>
-                <w:sz w:val="19"/>
-              </w:rPr>
-              <w:t>Retaining perimeter fence — unit share of the 70% estate-wide construction completed to date</w:t>
-            </w:r>
-          </w:p>
-        </w:tc>
-        <w:tc>
-          <w:tcPr>
-            <w:tcW w:type="dxa" w:w="2448"/>
-          </w:tcPr>
-          <w:p>
-            <w:r/>
-            <w:r>
-              <w:rPr>
-                <w:sz w:val="19"/>
-              </w:rPr>
-              <w:t>₦12,000,000</w:t>
-            </w:r>
-          </w:p>
-        </w:tc>
-      </w:tr>
-      <w:tr>
-        <w:tc>
-          <w:tcPr>
-            <w:tcW w:type="dxa" w:w="7056"/>
-          </w:tcPr>
-          <w:p>
-            <w:r/>
-            <w:r>
-              <w:rPr>
-                <w:sz w:val="19"/>
-              </w:rPr>
-              <w:t>Other shared site infrastructure to date (drainage, highway access tie-in works in progress)</w:t>
-            </w:r>
-          </w:p>
-        </w:tc>
-        <w:tc>
-          <w:tcPr>
-            <w:tcW w:type="dxa" w:w="2448"/>
-          </w:tcPr>
-          <w:p>
-            <w:r/>
-            <w:r>
-              <w:rPr>
-                <w:sz w:val="19"/>
-              </w:rPr>
-              <w:t>₦6,000,000</w:t>
-            </w:r>
-          </w:p>
-        </w:tc>
-      </w:tr>
-      <w:tr>
-        <w:tc>
-          <w:tcPr>
-            <w:tcW w:type="dxa" w:w="7056"/>
-          </w:tcPr>
-          <w:p>
-            <w:r/>
-            <w:r>
-              <w:rPr>
-                <w:sz w:val="19"/>
-              </w:rPr>
-              <w:t>Professional fees &amp; site supervision (foundation through decking phase)</w:t>
-            </w:r>
-          </w:p>
-        </w:tc>
-        <w:tc>
-          <w:tcPr>
-            <w:tcW w:type="dxa" w:w="2448"/>
-          </w:tcPr>
-          <w:p>
-            <w:r/>
-            <w:r>
-              <w:rPr>
-                <w:sz w:val="19"/>
-              </w:rPr>
-              <w:t>₦6,500,000</w:t>
-            </w:r>
-          </w:p>
-        </w:tc>
-      </w:tr>
-      <w:tr>
-        <w:tc>
-          <w:tcPr>
-            <w:tcW w:type="dxa" w:w="7056"/>
-          </w:tcPr>
-          <w:p>
-            <w:r/>
-            <w:r>
-              <w:rPr>
-                <w:sz w:val="19"/>
-              </w:rPr>
-              <w:t>Contingency (~5%)</w:t>
-            </w:r>
-          </w:p>
-        </w:tc>
-        <w:tc>
-          <w:tcPr>
-            <w:tcW w:type="dxa" w:w="2448"/>
-          </w:tcPr>
-          <w:p>
-            <w:r/>
-            <w:r>
-              <w:rPr>
-                <w:sz w:val="19"/>
-              </w:rPr>
-              <w:t>₦7,000,000</w:t>
+              <w:t>₦33,300,000</w:t>
             </w:r>
           </w:p>
         </w:tc>
@@ -1057,7 +877,7 @@
                 <w:color w:val="B8860B"/>
                 <w:sz w:val="19"/>
               </w:rPr>
-              <w:t>TOTAL ACTUAL COST TO DATE</w:t>
+              <w:t>TOTAL ACTUAL COST TO DATE — THIS UNIT</w:t>
             </w:r>
           </w:p>
         </w:tc>
@@ -1074,7 +894,7 @@
                 <w:color w:val="B8860B"/>
                 <w:sz w:val="19"/>
               </w:rPr>
-              <w:t>₦150,000,000</w:t>
+              <w:t>₦50,000,000</w:t>
             </w:r>
           </w:p>
         </w:tc>
@@ -1097,7 +917,7 @@
           <w:color w:val="555555"/>
           <w:sz w:val="20"/>
         </w:rPr>
-        <w:t>For reference, a carcass/lintel-roofed unfinished terrace unit in this corridor — a later, more advanced stage than this one — costs no less than ₦200,000,000 to reach that point. At ₦150,000,000, this unit's cost is proportionately lower, which is exactly consistent with its earlier pre-first-floor, pre-roofing stage — not a discrepancy, a confirmation.</w:t>
+        <w:t>This is the raw construction-cost picture, and it is intentionally a small number — it is not, and should not be, the basis for the sale price. What this unit is actually worth is a function of comparable market pricing and finished resale value, which is what Sections 4 and 5 are built on.</w:t>
       </w:r>
     </w:p>
     <w:p>
@@ -1292,7 +1112,7 @@
               <w:rPr>
                 <w:sz w:val="19"/>
               </w:rPr>
-              <w:t>₦150,000,000</w:t>
+              <w:t>₦50,000,000</w:t>
             </w:r>
           </w:p>
         </w:tc>
@@ -1338,7 +1158,7 @@
               <w:rPr>
                 <w:sz w:val="19"/>
               </w:rPr>
-              <w:t>Subtotal — full all-in cost to complete</w:t>
+              <w:t>Subtotal — full all-in build cost (raw cost basis only)</w:t>
             </w:r>
           </w:p>
         </w:tc>
@@ -1352,7 +1172,7 @@
               <w:rPr>
                 <w:sz w:val="19"/>
               </w:rPr>
-              <w:t>₦245,000,000</w:t>
+              <w:t>₦145,000,000</w:t>
             </w:r>
           </w:p>
         </w:tc>
@@ -1368,7 +1188,7 @@
               <w:rPr>
                 <w:sz w:val="19"/>
               </w:rPr>
-              <w:t>Location &amp; market premium (highway-fronted, gated 9-unit exclusivity, comparable corridor pricing)</w:t>
+              <w:t>Market &amp; location premium (comparable corridor pricing, highway-fronted, gated 9-unit exclusivity — this is what actually sets the price, not the cost line above)</w:t>
             </w:r>
           </w:p>
         </w:tc>
@@ -1382,7 +1202,7 @@
               <w:rPr>
                 <w:sz w:val="19"/>
               </w:rPr>
-              <w:t>₦205,000,000</w:t>
+              <w:t>₦305,000,000</w:t>
             </w:r>
           </w:p>
         </w:tc>
@@ -1401,7 +1221,7 @@
                 <w:color w:val="B8860B"/>
                 <w:sz w:val="19"/>
               </w:rPr>
-              <w:t>FINISHED RESALE VALUATION — PER UNIT</w:t>
+              <w:t>FINISHED RESALE VALUATION — PER UNIT (market-based)</w:t>
             </w:r>
           </w:p>
         </w:tc>
@@ -1533,10 +1353,107 @@
         <w:rPr>
           <w:rFonts w:ascii="Calibri" w:hAnsi="Calibri"/>
           <w:b w:val="0"/>
+          <w:i w:val="0"/>
           <w:color w:val="222222"/>
           <w:sz w:val="22"/>
         </w:rPr>
-        <w:t xml:space="preserve">The standing offer price for this unit at its current stage is </w:t>
+        <w:t>This price is not built off what has been spent so far — you already have that number, and it is small relative to this offer, deliberately so. Pricing this off raw construction cost would misread the asset entirely. What actually sets the value of this unit is where it sits in the market: a highway-fronted, 9-unit gated luxury terrace corridor, priced against genuine comparables and what the finished unit will sell for.</w:t>
+      </w:r>
+    </w:p>
+    <w:tbl>
+      <w:tblPr>
+        <w:tblW w:type="auto" w:w="0"/>
+        <w:jc w:val="center"/>
+        <w:tblLook w:firstColumn="1" w:firstRow="1" w:lastColumn="0" w:lastRow="0" w:noHBand="0" w:noVBand="1" w:val="04A0"/>
+      </w:tblPr>
+      <w:tblGrid>
+        <w:gridCol w:w="8640"/>
+      </w:tblGrid>
+      <w:tr>
+        <w:tc>
+          <w:tcPr>
+            <w:tcW w:type="dxa" w:w="8640"/>
+            <w:shd w:val="clear" w:color="auto" w:fill="F2ECD9"/>
+          </w:tcPr>
+          <w:p>
+            <w:r/>
+            <w:r>
+              <w:rPr>
+                <w:b/>
+                <w:color w:val="8A6A00"/>
+                <w:sz w:val="20"/>
+              </w:rPr>
+              <w:t>MARKET COMPARABLE — WHY THIS RANGE IS REALISTIC</w:t>
+            </w:r>
+          </w:p>
+          <w:p>
+            <w:pPr>
+              <w:spacing w:after="40"/>
+            </w:pPr>
+            <w:r>
+              <w:rPr>
+                <w:color w:val="222222"/>
+                <w:sz w:val="19"/>
+              </w:rPr>
+              <w:t>A carcass/lintel-roofed unfinished terrace unit in this corridor — a later, more advanced stage than this</w:t>
+            </w:r>
+          </w:p>
+          <w:p>
+            <w:pPr>
+              <w:spacing w:after="40"/>
+            </w:pPr>
+            <w:r>
+              <w:rPr>
+                <w:color w:val="222222"/>
+                <w:sz w:val="19"/>
+              </w:rPr>
+              <w:t>unit — already trades at no less than ₦200,000,000 on the open market. That is the market floor for a unit</w:t>
+            </w:r>
+          </w:p>
+          <w:p>
+            <w:pPr>
+              <w:spacing w:after="40"/>
+            </w:pPr>
+            <w:r>
+              <w:rPr>
+                <w:color w:val="222222"/>
+                <w:sz w:val="19"/>
+              </w:rPr>
+              <w:t>further along than this one. Against that floor, and against the ₦450,000,000 finished resale comparable in</w:t>
+            </w:r>
+          </w:p>
+          <w:p>
+            <w:pPr>
+              <w:spacing w:after="40"/>
+            </w:pPr>
+            <w:r>
+              <w:rPr>
+                <w:color w:val="222222"/>
+                <w:sz w:val="19"/>
+              </w:rPr>
+              <w:t>this corridor, ₦350,000,000 for a unit at this stage is a defensible mid-point, not an inflated ask.</w:t>
+            </w:r>
+          </w:p>
+        </w:tc>
+      </w:tr>
+    </w:tbl>
+    <w:p>
+      <w:pPr>
+        <w:spacing w:after="80"/>
+      </w:pPr>
+    </w:p>
+    <w:p>
+      <w:pPr>
+        <w:spacing w:after="160" w:line="276" w:lineRule="auto"/>
+      </w:pPr>
+      <w:r>
+        <w:rPr>
+          <w:rFonts w:ascii="Calibri" w:hAnsi="Calibri"/>
+          <w:b w:val="0"/>
+          <w:color w:val="222222"/>
+          <w:sz w:val="22"/>
+        </w:rPr>
+        <w:t xml:space="preserve">The standing offer price is </w:t>
       </w:r>
       <w:r>
         <w:rPr>
@@ -1572,7 +1489,7 @@
           <w:color w:val="222222"/>
           <w:sz w:val="22"/>
         </w:rPr>
-        <w:t xml:space="preserve"> the ₦450,000,000 finished resale valuation established in Section 4. That gap is the headline number: no comparable finished unit in this corridor trades anywhere near ₦350M.</w:t>
+        <w:t xml:space="preserve"> the ₦450,000,000 finished resale valuation established in Section 4. That gap to finished market value is the number that matters, not the cost line in Section 3.</w:t>
       </w:r>
     </w:p>
     <w:p>
@@ -1640,7 +1557,7 @@
           <w:color w:val="222222"/>
           <w:sz w:val="22"/>
         </w:rPr>
-        <w:t xml:space="preserve">. Against a </w:t>
+        <w:t xml:space="preserve"> against a </w:t>
       </w:r>
       <w:r>
         <w:rPr>
@@ -1658,22 +1575,7 @@
           <w:color w:val="222222"/>
           <w:sz w:val="22"/>
         </w:rPr>
-        <w:t xml:space="preserve"> finished resale valuation, that already clears your build cost with room to spare — before any further market movement from the highway's continued impact on this corridor.</w:t>
-      </w:r>
-    </w:p>
-    <w:p>
-      <w:pPr>
-        <w:spacing w:after="160" w:line="276" w:lineRule="auto"/>
-      </w:pPr>
-      <w:r>
-        <w:rPr>
-          <w:rFonts w:ascii="Calibri" w:hAnsi="Calibri"/>
-          <w:b w:val="0"/>
-          <w:i w:val="0"/>
-          <w:color w:val="222222"/>
-          <w:sz w:val="22"/>
-        </w:rPr>
-        <w:t>From the seller's side, this price recovers the full ₦150,000,000 actually invested in land and structure to date, plus a development margin of ₦200,000,000 — proportionate to a project sitting directly on a newly built highway in one of Abuja's most closely watched luxury corridors, and still well below the ₦450,000,000 ceiling the finished product commands.</w:t>
+        <w:t xml:space="preserve"> finished resale valuation — a position that clears itself on completion, before any further market movement from the highway's continued impact on this corridor is even counted.</w:t>
       </w:r>
     </w:p>
     <w:p>

</xml_diff>